<commit_message>
docs(week1): lock appendix G product decisions
</commit_message>
<xml_diff>
--- a/docs/week1/03_角色C_数据库检索整合任务书.docx
+++ b/docs/week1/03_角色C_数据库检索整合任务书.docx
@@ -22,7 +22,7 @@
           <w:color w:val="4B5563"/>
           <w:sz w:val="22"/>
         </w:rPr>
-        <w:t>SQLite  RolePolicy  Evidence-RAG  HTTPS部署  项目总和</w:t>
+        <w:t>Flask API  React Vite  SQLite  RolePolicy  项目总和</w:t>
       </w:r>
     </w:p>
     <w:p>
@@ -666,7 +666,7 @@
                 <w:color w:val="1F2937"/>
                 <w:sz w:val="17"/>
               </w:rPr>
-              <w:t>传统查询、三角色详情和证据页面</w:t>
+              <w:t>React/Vite传统查询、三角色详情和证据页面</w:t>
             </w:r>
           </w:p>
         </w:tc>
@@ -840,7 +840,7 @@
                 <w:color w:val="1F2937"/>
                 <w:sz w:val="17"/>
               </w:rPr>
-              <w:t>A/B整合与Evidence-RAG</w:t>
+              <w:t>A/B整合与带引用回答</w:t>
             </w:r>
           </w:p>
         </w:tc>
@@ -1015,7 +1015,7 @@
                 <w:color w:val="1F2937"/>
                 <w:sz w:val="17"/>
               </w:rPr>
-              <w:t>公共HTTPS、局域网灾备、移动端和录屏</w:t>
+              <w:t>LAN健康检查、云端HTTPS部署清单、移动端和录屏</w:t>
             </w:r>
           </w:p>
         </w:tc>
@@ -1117,7 +1117,7 @@
                 <w:color w:val="1F2937"/>
                 <w:sz w:val="17"/>
               </w:rPr>
-              <w:t>健康检查通过，30次查询&lt;1秒</w:t>
+              <w:t>另一台LAN设备健康检查通过，30次查询&lt;1秒</w:t>
             </w:r>
           </w:p>
         </w:tc>
@@ -1178,7 +1178,7 @@
           <w:color w:val="1F2937"/>
           <w:sz w:val="21"/>
         </w:rPr>
-        <w:t>□  在目标Python环境测试SQLite版本、FTS5和trigram；若trigram不可用，保留FTS5和归一化LIKE回退。</w:t>
+        <w:t>□  在目标Python环境测试SQLite版本、FTS5和trigram；若trigram不可用，保留FTS5和归一化LIKE回退。确认Node、npm和Vite可用，第一周不安装Embedding模型。</w:t>
       </w:r>
     </w:p>
     <w:p>
@@ -1779,7 +1779,7 @@
                 <w:color w:val="1F2937"/>
                 <w:sz w:val="17"/>
               </w:rPr>
-              <w:t>templates/static</w:t>
+              <w:t>frontend/src</w:t>
             </w:r>
           </w:p>
         </w:tc>
@@ -1813,7 +1813,7 @@
                 <w:color w:val="1F2937"/>
                 <w:sz w:val="17"/>
               </w:rPr>
-              <w:t>现有原型的Jinja2页面、CSS和浏览器交互</w:t>
+              <w:t>React、TypeScript、Vite页面、组件、样式和浏览器交互</w:t>
             </w:r>
           </w:p>
         </w:tc>
@@ -2711,7 +2711,7 @@
         <w:pStyle w:val="Heading1"/>
       </w:pPr>
       <w:r>
-        <w:t>Evidence-RAG 与降级</w:t>
+        <w:t>带引用回答 与降级</w:t>
       </w:r>
     </w:p>
     <w:p>
@@ -3491,7 +3491,7 @@
         <w:pStyle w:val="Heading1"/>
       </w:pPr>
       <w:r>
-        <w:t>页面迁移</w:t>
+        <w:t>React/Vite页面迁移</w:t>
       </w:r>
     </w:p>
     <w:p>
@@ -3502,7 +3502,7 @@
           <w:color w:val="1F2937"/>
           <w:sz w:val="21"/>
         </w:rPr>
-        <w:t>保留当前静态原型的版式、搜索切换、QueryPlan、结果列表、详情、复核状态和证据对照。把app.js中的3条虚构记录替换为服务端DTO，不重新设计与检索无关的页面。游客只能看到服务端生成的脱敏字段和派生资源，student/teacher经CAS/SSO查看授权完整视图，admin才可同步、复核、发布和查看日志。</w:t>
+        <w:t>在frontend中用React、TypeScript和Vite迁移当前静态原型的搜索切换、QueryPlan、结果列表、详情、复核状态和证据对照。开发环境通过Vite代理/api，生产构建与Flask同源。把app.js中的3条虚构记录替换为服务端DTO。视觉使用民大红#A20000和中性色，不沿用墨绿主色。游客只能看到服务端生成的脱敏字段和派生资源，student/teacher经CAS/SSO查看授权字段，完整海报默认关闭，admin才可同步、复核、发布和查看日志。</w:t>
       </w:r>
     </w:p>
     <w:p>
@@ -4366,7 +4366,7 @@
                 <w:color w:val="1F2937"/>
                 <w:sz w:val="17"/>
               </w:rPr>
-              <w:t>公共HTTPS</w:t>
+              <w:t>LAN健康检查与云端部署清单</w:t>
             </w:r>
           </w:p>
         </w:tc>
@@ -4401,7 +4401,7 @@
                 <w:color w:val="1F2937"/>
                 <w:sz w:val="17"/>
               </w:rPr>
-              <w:t>公网访问首页、传统查询和/healthz</w:t>
+              <w:t>另一台LAN设备访问首页、传统查询和/healthz，并检查云端部署清单</w:t>
             </w:r>
           </w:p>
         </w:tc>
@@ -4436,7 +4436,7 @@
                 <w:color w:val="1F2937"/>
                 <w:sz w:val="17"/>
               </w:rPr>
-              <w:t>HTTPS有效，健康检查2xx</w:t>
+              <w:t>LAN健康检查2xx；服务器、域名、反向代理、证书和续期项齐全</w:t>
             </w:r>
           </w:p>
         </w:tc>
@@ -4678,7 +4678,7 @@
           <w:color w:val="1F2937"/>
           <w:sz w:val="21"/>
         </w:rPr>
-        <w:t>1.  用公共HTTPS打开首页与/healthz，展示数据量和更新时间，并说明局域网灾备。</w:t>
+        <w:t>1.  用另一台LAN设备打开React首页与/healthz，展示数据量和更新时间，并展示云端HTTPS部署清单。</w:t>
       </w:r>
     </w:p>
     <w:p>
@@ -4723,7 +4723,7 @@
           <w:color w:val="1F2937"/>
           <w:sz w:val="21"/>
         </w:rPr>
-        <w:t>4.  切换guest、student/teacher、admin并验证脱敏、完整视图、管理权限和越权拒绝。</w:t>
+        <w:t>4.  切换guest、student/teacher、admin并验证脱敏、授权字段、完整海报默认关闭、管理权限和越权拒绝。</w:t>
       </w:r>
     </w:p>
     <w:p>
@@ -5184,7 +5184,7 @@
                 <w:color w:val="1F2937"/>
                 <w:sz w:val="17"/>
               </w:rPr>
-              <w:t>feat(web): connect search and evidence views</w:t>
+              <w:t>feat(web): migrate prototype to React Vite</w:t>
             </w:r>
           </w:p>
         </w:tc>
@@ -5218,7 +5218,7 @@
                 <w:color w:val="1F2937"/>
                 <w:sz w:val="17"/>
               </w:rPr>
-              <w:t>Flask、Jinja2和现有视觉</w:t>
+              <w:t>Flask API、React/Vite和民大红视觉</w:t>
             </w:r>
           </w:p>
         </w:tc>
@@ -5395,7 +5395,7 @@
                 <w:color w:val="1F2937"/>
                 <w:sz w:val="17"/>
               </w:rPr>
-              <w:t>feat(deploy): add https health and backup runbook</w:t>
+              <w:t>feat(deploy): add lan health and https runbook</w:t>
             </w:r>
           </w:p>
         </w:tc>
@@ -5429,7 +5429,7 @@
                 <w:color w:val="1F2937"/>
                 <w:sz w:val="17"/>
               </w:rPr>
-              <w:t>公共URL、健康检查和局域网灾备</w:t>
+              <w:t>LAN健康检查、云端HTTPS清单和灾备说明</w:t>
             </w:r>
           </w:p>
         </w:tc>
@@ -5688,6 +5688,99 @@
     <w:p>
       <w:pPr>
         <w:pStyle w:val="Heading1"/>
+        <w:spacing w:after="40" w:line="240" w:lineRule="auto"/>
+      </w:pPr>
+      <w:r>
+        <w:t>附录 G 实现约束</w:t>
+      </w:r>
+    </w:p>
+    <w:p>
+      <w:pPr>
+        <w:pStyle w:val="ListBullet"/>
+        <w:spacing w:after="40" w:line="240" w:lineRule="auto"/>
+      </w:pPr>
+      <w:r>
+        <w:rPr>
+          <w:sz w:val="19"/>
+        </w:rPr>
+        <w:t>正式前端固定为 React、TypeScript 和 Vite，Flask只提供API。开发环境使用Vite代理/api，生产构建与Flask同源部署。</w:t>
+      </w:r>
+    </w:p>
+    <w:p>
+      <w:pPr>
+        <w:pStyle w:val="ListBullet"/>
+        <w:spacing w:after="40" w:line="240" w:lineRule="auto"/>
+      </w:pPr>
+      <w:r>
+        <w:rPr>
+          <w:sz w:val="19"/>
+        </w:rPr>
+        <w:t>视觉主强调色使用民大红#A20000。首页为单搜索框加传统/AI分段切换；桌面紧凑列表，移动端单列大卡。不得继续使用墨绿主色。</w:t>
+      </w:r>
+    </w:p>
+    <w:p>
+      <w:pPr>
+        <w:pStyle w:val="ListBullet"/>
+        <w:spacing w:after="40" w:line="240" w:lineRule="auto"/>
+      </w:pPr>
+      <w:r>
+        <w:rPr>
+          <w:sz w:val="19"/>
+        </w:rPr>
+        <w:t>正式认证目标为CAS/SSO。开发角色开关只在显式开发环境变量下可用，生产模式必须返回404或禁用。校内完整海报默认关闭。</w:t>
+      </w:r>
+    </w:p>
+    <w:p>
+      <w:pPr>
+        <w:pStyle w:val="ListBullet"/>
+        <w:spacing w:after="40" w:line="240" w:lineRule="auto"/>
+      </w:pPr>
+      <w:r>
+        <w:rPr>
+          <w:sz w:val="19"/>
+        </w:rPr>
+        <w:t>第一周不启用Embedding，当前项目不做语义检索。自然语言查询使用白名单QueryPlan、结构化/FTS5/LIKE检索和可选的带引用总结。</w:t>
+      </w:r>
+    </w:p>
+    <w:p>
+      <w:pPr>
+        <w:pStyle w:val="ListBullet"/>
+        <w:spacing w:after="40" w:line="240" w:lineRule="auto"/>
+      </w:pPr>
+      <w:r>
+        <w:rPr>
+          <w:sz w:val="19"/>
+        </w:rPr>
+        <w:t>第一周保住对比台、四Sheet Excel/CSV导出和当前结果可视化，并冻结保存搜索、站内提醒、隐私中心和无痕模式所需接口；第二周完成持久化。</w:t>
+      </w:r>
+    </w:p>
+    <w:p>
+      <w:pPr>
+        <w:pStyle w:val="ListBullet"/>
+        <w:spacing w:after="40" w:line="240" w:lineRule="auto"/>
+      </w:pPr>
+      <w:r>
+        <w:rPr>
+          <w:sz w:val="19"/>
+        </w:rPr>
+        <w:t>搜索历史和推荐默认关闭，用户主动开启后保存90天。访客响应不得包含姓名、头像、二维码、联系方式、会议入口、原始海报、本机路径或需要CAS的直接来源URL。</w:t>
+      </w:r>
+    </w:p>
+    <w:p>
+      <w:pPr>
+        <w:pStyle w:val="ListBullet"/>
+        <w:spacing w:after="40" w:line="240" w:lineRule="auto"/>
+      </w:pPr>
+      <w:r>
+        <w:rPr>
+          <w:sz w:val="19"/>
+        </w:rPr>
+        <w:t>本周以本机和另一台LAN设备访问及/healthz为部署硬门槛，并提交服务器、域名、反向代理、Let’s Encrypt证书、自动续期和备份清单。</w:t>
+      </w:r>
+    </w:p>
+    <w:p>
+      <w:pPr>
+        <w:pStyle w:val="Heading1"/>
       </w:pPr>
       <w:r>
         <w:t>最终自查</w:t>
@@ -5780,7 +5873,7 @@
           <w:color w:val="1F2937"/>
           <w:sz w:val="21"/>
         </w:rPr>
-        <w:t>□  公共HTTPS和/healthz可用；另一台局域网设备完成灾备演示。</w:t>
+        <w:t>□  本机和另一台LAN设备均可访问/healthz；云端HTTPS部署清单完整。</w:t>
       </w:r>
     </w:p>
     <w:p>

</xml_diff>